<commit_message>
replace frontmatter and add colrev dependency
</commit_message>
<xml_diff>
--- a/labot/review_template.docx
+++ b/labot/review_template.docx
@@ -1,6 +1,6 @@
 
 <file path=word/document.xml><?xml version="1.0" encoding="utf-8"?>
-<w:document xmlns:wpc="http://schemas.microsoft.com/office/word/2010/wordprocessingCanvas" xmlns:cx="http://schemas.microsoft.com/office/drawing/2014/chartex" xmlns:cx1="http://schemas.microsoft.com/office/drawing/2015/9/8/chartex" xmlns:cx2="http://schemas.microsoft.com/office/drawing/2015/10/21/chartex" xmlns:cx3="http://schemas.microsoft.com/office/drawing/2016/5/9/chartex" xmlns:cx4="http://schemas.microsoft.com/office/drawing/2016/5/10/chartex" xmlns:cx5="http://schemas.microsoft.com/office/drawing/2016/5/11/chartex" xmlns:cx6="http://schemas.microsoft.com/office/drawing/2016/5/12/chartex" xmlns:cx7="http://schemas.microsoft.com/office/drawing/2016/5/13/chartex" xmlns:cx8="http://schemas.microsoft.com/office/drawing/2016/5/14/chartex" xmlns:mc="http://schemas.openxmlformats.org/markup-compatibility/2006" xmlns:aink="http://schemas.microsoft.com/office/drawing/2016/ink" xmlns:am3d="http://schemas.microsoft.com/office/drawing/2017/model3d" xmlns:o="urn:schemas-microsoft-com:office:office" xmlns:oel="http://schemas.microsoft.com/office/2019/extlst" xmlns:r="http://schemas.openxmlformats.org/officeDocument/2006/relationships" xmlns:m="http://schemas.openxmlformats.org/officeDocument/2006/math" xmlns:v="urn:schemas-microsoft-com:vml" xmlns:wp14="http://schemas.microsoft.com/office/word/2010/wordprocessingDrawing" xmlns:wp="http://schemas.openxmlformats.org/drawingml/2006/wordprocessingDrawing" xmlns:w10="urn:schemas-microsoft-com:office:word" xmlns:w="http://schemas.openxmlformats.org/wordprocessingml/2006/main" xmlns:w14="http://schemas.microsoft.com/office/word/2010/wordml" xmlns:w15="http://schemas.microsoft.com/office/word/2012/wordml" xmlns:w16cex="http://schemas.microsoft.com/office/word/2018/wordml/cex" xmlns:w16cid="http://schemas.microsoft.com/office/word/2016/wordml/cid" xmlns:w16="http://schemas.microsoft.com/office/word/2018/wordml" xmlns:w16sdtdh="http://schemas.microsoft.com/office/word/2020/wordml/sdtdatahash" xmlns:w16se="http://schemas.microsoft.com/office/word/2015/wordml/symex" xmlns:wpg="http://schemas.microsoft.com/office/word/2010/wordprocessingGroup" xmlns:wpi="http://schemas.microsoft.com/office/word/2010/wordprocessingInk" xmlns:wne="http://schemas.microsoft.com/office/word/2006/wordml" xmlns:wps="http://schemas.microsoft.com/office/word/2010/wordprocessingShape" mc:Ignorable="w14 w15 w16se w16cid w16 w16cex w16sdtdh wp14">
+<w:document xmlns:wpc="http://schemas.microsoft.com/office/word/2010/wordprocessingCanvas" xmlns:cx="http://schemas.microsoft.com/office/drawing/2014/chartex" xmlns:cx1="http://schemas.microsoft.com/office/drawing/2015/9/8/chartex" xmlns:cx2="http://schemas.microsoft.com/office/drawing/2015/10/21/chartex" xmlns:cx3="http://schemas.microsoft.com/office/drawing/2016/5/9/chartex" xmlns:cx4="http://schemas.microsoft.com/office/drawing/2016/5/10/chartex" xmlns:cx5="http://schemas.microsoft.com/office/drawing/2016/5/11/chartex" xmlns:cx6="http://schemas.microsoft.com/office/drawing/2016/5/12/chartex" xmlns:cx7="http://schemas.microsoft.com/office/drawing/2016/5/13/chartex" xmlns:cx8="http://schemas.microsoft.com/office/drawing/2016/5/14/chartex" xmlns:mc="http://schemas.openxmlformats.org/markup-compatibility/2006" xmlns:aink="http://schemas.microsoft.com/office/drawing/2016/ink" xmlns:am3d="http://schemas.microsoft.com/office/drawing/2017/model3d" xmlns:o="urn:schemas-microsoft-com:office:office" xmlns:oel="http://schemas.microsoft.com/office/2019/extlst" xmlns:r="http://schemas.openxmlformats.org/officeDocument/2006/relationships" xmlns:m="http://schemas.openxmlformats.org/officeDocument/2006/math" xmlns:v="urn:schemas-microsoft-com:vml" xmlns:wp14="http://schemas.microsoft.com/office/word/2010/wordprocessingDrawing" xmlns:wp="http://schemas.openxmlformats.org/drawingml/2006/wordprocessingDrawing" xmlns:w10="urn:schemas-microsoft-com:office:word" xmlns:w="http://schemas.openxmlformats.org/wordprocessingml/2006/main" xmlns:w14="http://schemas.microsoft.com/office/word/2010/wordml" xmlns:w15="http://schemas.microsoft.com/office/word/2012/wordml" xmlns:w16cex="http://schemas.microsoft.com/office/word/2018/wordml/cex" xmlns:w16cid="http://schemas.microsoft.com/office/word/2016/wordml/cid" xmlns:w16="http://schemas.microsoft.com/office/word/2018/wordml" xmlns:w16du="http://schemas.microsoft.com/office/word/2023/wordml/word16du" xmlns:w16sdtdh="http://schemas.microsoft.com/office/word/2020/wordml/sdtdatahash" xmlns:w16sdtfl="http://schemas.microsoft.com/office/word/2024/wordml/sdtformatlock" xmlns:w16se="http://schemas.microsoft.com/office/word/2015/wordml/symex" xmlns:wpg="http://schemas.microsoft.com/office/word/2010/wordprocessingGroup" xmlns:wpi="http://schemas.microsoft.com/office/word/2010/wordprocessingInk" xmlns:wne="http://schemas.microsoft.com/office/word/2006/wordml" xmlns:wps="http://schemas.microsoft.com/office/word/2010/wordprocessingShape" mc:Ignorable="w14 w15 w16se w16cid w16 w16cex w16sdtdh w16sdtfl w16du wp14">
   <w:body>
     <w:p/>
     <w:p/>
@@ -57,15 +57,40 @@
     <w:p>
       <w:pPr>
         <w:rPr>
-          <w:b/>
-          <w:bCs/>
-          <w:sz w:val="22"/>
-          <w:szCs w:val="22"/>
-        </w:rPr>
-      </w:pPr>
-      <w:r>
-        <w:rPr>
-          <w:b/>
+          <w:bCs/>
+          <w:sz w:val="22"/>
+          <w:szCs w:val="22"/>
+        </w:rPr>
+      </w:pPr>
+      <w:r>
+        <w:rPr>
+          <w:b/>
+          <w:bCs/>
+          <w:sz w:val="22"/>
+          <w:szCs w:val="22"/>
+        </w:rPr>
+        <w:t>Candidate:</w:t>
+      </w:r>
+      <w:r>
+        <w:rPr>
+          <w:b/>
+          <w:bCs/>
+          <w:sz w:val="22"/>
+          <w:szCs w:val="22"/>
+        </w:rPr>
+        <w:tab/>
+      </w:r>
+      <w:r>
+        <w:rPr>
+          <w:b/>
+          <w:bCs/>
+          <w:sz w:val="22"/>
+          <w:szCs w:val="22"/>
+        </w:rPr>
+        <w:tab/>
+      </w:r>
+      <w:r>
+        <w:rPr>
           <w:bCs/>
           <w:sz w:val="22"/>
           <w:szCs w:val="22"/>
@@ -74,16 +99,14 @@
       </w:r>
       <w:r>
         <w:rPr>
-          <w:b/>
-          <w:bCs/>
-          <w:sz w:val="22"/>
-          <w:szCs w:val="22"/>
-        </w:rPr>
-        <w:instrText xml:space="preserve"> MERGEFIELD  subject  \* MERGEFORMAT </w:instrText>
-      </w:r>
-      <w:r>
-        <w:rPr>
-          <w:b/>
+          <w:bCs/>
+          <w:sz w:val="22"/>
+          <w:szCs w:val="22"/>
+        </w:rPr>
+        <w:instrText xml:space="preserve"> MERGEFIELD  candidate  \* MERGEFORMAT </w:instrText>
+      </w:r>
+      <w:r>
+        <w:rPr>
           <w:bCs/>
           <w:sz w:val="22"/>
           <w:szCs w:val="22"/>
@@ -92,16 +115,14 @@
       </w:r>
       <w:r>
         <w:rPr>
-          <w:b/>
-          <w:bCs/>
-          <w:sz w:val="22"/>
-          <w:szCs w:val="22"/>
-        </w:rPr>
-        <w:t>«subject»</w:t>
-      </w:r>
-      <w:r>
-        <w:rPr>
-          <w:b/>
+          <w:bCs/>
+          <w:sz w:val="22"/>
+          <w:szCs w:val="22"/>
+        </w:rPr>
+        <w:t>«candidate»</w:t>
+      </w:r>
+      <w:r>
+        <w:rPr>
           <w:bCs/>
           <w:sz w:val="22"/>
           <w:szCs w:val="22"/>
@@ -112,29 +133,19 @@
     <w:p>
       <w:pPr>
         <w:rPr>
-          <w:b/>
-          <w:bCs/>
-          <w:sz w:val="22"/>
-          <w:szCs w:val="22"/>
-        </w:rPr>
-      </w:pPr>
-    </w:p>
-    <w:p>
-      <w:pPr>
-        <w:rPr>
-          <w:bCs/>
-          <w:sz w:val="22"/>
-          <w:szCs w:val="22"/>
-        </w:rPr>
-      </w:pPr>
-      <w:r>
-        <w:rPr>
-          <w:b/>
-          <w:bCs/>
-          <w:sz w:val="22"/>
-          <w:szCs w:val="22"/>
-        </w:rPr>
-        <w:t>Candidate:</w:t>
+          <w:bCs/>
+          <w:sz w:val="22"/>
+          <w:szCs w:val="22"/>
+        </w:rPr>
+      </w:pPr>
+      <w:r>
+        <w:rPr>
+          <w:b/>
+          <w:bCs/>
+          <w:sz w:val="22"/>
+          <w:szCs w:val="22"/>
+        </w:rPr>
+        <w:t>Student ID:</w:t>
       </w:r>
       <w:r>
         <w:rPr>
@@ -168,7 +179,7 @@
           <w:sz w:val="22"/>
           <w:szCs w:val="22"/>
         </w:rPr>
-        <w:instrText xml:space="preserve"> MERGEFIELD  candidate  \* MERGEFORMAT </w:instrText>
+        <w:instrText xml:space="preserve"> MERGEFIELD  student_id  \* MERGEFORMAT </w:instrText>
       </w:r>
       <w:r>
         <w:rPr>
@@ -184,7 +195,7 @@
           <w:sz w:val="22"/>
           <w:szCs w:val="22"/>
         </w:rPr>
-        <w:t>«candidate»</w:t>
+        <w:t>«student_id»</w:t>
       </w:r>
       <w:r>
         <w:rPr>
@@ -198,19 +209,20 @@
     <w:p>
       <w:pPr>
         <w:rPr>
-          <w:bCs/>
-          <w:sz w:val="22"/>
-          <w:szCs w:val="22"/>
-        </w:rPr>
-      </w:pPr>
-      <w:r>
-        <w:rPr>
-          <w:b/>
-          <w:bCs/>
-          <w:sz w:val="22"/>
-          <w:szCs w:val="22"/>
-        </w:rPr>
-        <w:t>Student ID:</w:t>
+          <w:b/>
+          <w:bCs/>
+          <w:sz w:val="22"/>
+          <w:szCs w:val="22"/>
+        </w:rPr>
+      </w:pPr>
+      <w:r>
+        <w:rPr>
+          <w:b/>
+          <w:bCs/>
+          <w:sz w:val="22"/>
+          <w:szCs w:val="22"/>
+        </w:rPr>
+        <w:t>Thesis ID:</w:t>
       </w:r>
       <w:r>
         <w:rPr>
@@ -244,7 +256,7 @@
           <w:sz w:val="22"/>
           <w:szCs w:val="22"/>
         </w:rPr>
-        <w:instrText xml:space="preserve"> MERGEFIELD  student_id  \* MERGEFORMAT </w:instrText>
+        <w:instrText xml:space="preserve"> MERGEFIELD  thesis_id  \* MERGEFORMAT </w:instrText>
       </w:r>
       <w:r>
         <w:rPr>
@@ -260,25 +272,7 @@
           <w:sz w:val="22"/>
           <w:szCs w:val="22"/>
         </w:rPr>
-        <w:t>«</w:t>
-      </w:r>
-      <w:proofErr w:type="spellStart"/>
-      <w:r>
-        <w:rPr>
-          <w:bCs/>
-          <w:sz w:val="22"/>
-          <w:szCs w:val="22"/>
-        </w:rPr>
-        <w:t>student_id</w:t>
-      </w:r>
-      <w:proofErr w:type="spellEnd"/>
-      <w:r>
-        <w:rPr>
-          <w:bCs/>
-          <w:sz w:val="22"/>
-          <w:szCs w:val="22"/>
-        </w:rPr>
-        <w:t>»</w:t>
+        <w:t>«thesis_id»</w:t>
       </w:r>
       <w:r>
         <w:rPr>
@@ -305,7 +299,16 @@
           <w:sz w:val="22"/>
           <w:szCs w:val="22"/>
         </w:rPr>
-        <w:t>Thesis ID:</w:t>
+        <w:t>Title:</w:t>
+      </w:r>
+      <w:r>
+        <w:rPr>
+          <w:b/>
+          <w:bCs/>
+          <w:sz w:val="22"/>
+          <w:szCs w:val="22"/>
+        </w:rPr>
+        <w:tab/>
       </w:r>
       <w:r>
         <w:rPr>
@@ -339,7 +342,7 @@
           <w:sz w:val="22"/>
           <w:szCs w:val="22"/>
         </w:rPr>
-        <w:instrText xml:space="preserve"> MERGEFIELD  thesis_id  \* MERGEFORMAT </w:instrText>
+        <w:instrText xml:space="preserve"> MERGEFIELD  title  \* MERGEFORMAT </w:instrText>
       </w:r>
       <w:r>
         <w:rPr>
@@ -355,25 +358,7 @@
           <w:sz w:val="22"/>
           <w:szCs w:val="22"/>
         </w:rPr>
-        <w:t>«</w:t>
-      </w:r>
-      <w:proofErr w:type="spellStart"/>
-      <w:r>
-        <w:rPr>
-          <w:bCs/>
-          <w:sz w:val="22"/>
-          <w:szCs w:val="22"/>
-        </w:rPr>
-        <w:t>thesis_id</w:t>
-      </w:r>
-      <w:proofErr w:type="spellEnd"/>
-      <w:r>
-        <w:rPr>
-          <w:bCs/>
-          <w:sz w:val="22"/>
-          <w:szCs w:val="22"/>
-        </w:rPr>
-        <w:t>»</w:t>
+        <w:t>«title»</w:t>
       </w:r>
       <w:r>
         <w:rPr>
@@ -393,42 +378,15 @@
           <w:szCs w:val="22"/>
         </w:rPr>
       </w:pPr>
-      <w:r>
-        <w:rPr>
-          <w:b/>
-          <w:bCs/>
-          <w:sz w:val="22"/>
-          <w:szCs w:val="22"/>
-        </w:rPr>
-        <w:t>Title:</w:t>
-      </w:r>
-      <w:r>
-        <w:rPr>
-          <w:b/>
-          <w:bCs/>
-          <w:sz w:val="22"/>
-          <w:szCs w:val="22"/>
-        </w:rPr>
-        <w:tab/>
-      </w:r>
-      <w:r>
-        <w:rPr>
-          <w:b/>
-          <w:bCs/>
-          <w:sz w:val="22"/>
-          <w:szCs w:val="22"/>
-        </w:rPr>
-        <w:tab/>
-      </w:r>
-      <w:r>
-        <w:rPr>
-          <w:b/>
-          <w:bCs/>
-          <w:sz w:val="22"/>
-          <w:szCs w:val="22"/>
-        </w:rPr>
-        <w:tab/>
-      </w:r>
+    </w:p>
+    <w:p>
+      <w:pPr>
+        <w:rPr>
+          <w:bCs/>
+          <w:sz w:val="22"/>
+          <w:szCs w:val="22"/>
+        </w:rPr>
+      </w:pPr>
       <w:r>
         <w:rPr>
           <w:bCs/>
@@ -443,7 +401,7 @@
           <w:sz w:val="22"/>
           <w:szCs w:val="22"/>
         </w:rPr>
-        <w:instrText xml:space="preserve"> MERGEFIELD  title  \* MERGEFORMAT </w:instrText>
+        <w:instrText xml:space="preserve"> MERGEFIELD  review  \* MERGEFORMAT </w:instrText>
       </w:r>
       <w:r>
         <w:rPr>
@@ -456,10 +414,11 @@
       <w:r>
         <w:rPr>
           <w:bCs/>
-          <w:sz w:val="22"/>
-          <w:szCs w:val="22"/>
-        </w:rPr>
-        <w:t>«title»</w:t>
+          <w:noProof/>
+          <w:sz w:val="22"/>
+          <w:szCs w:val="22"/>
+        </w:rPr>
+        <w:t>«review»</w:t>
       </w:r>
       <w:r>
         <w:rPr>
@@ -481,84 +440,14 @@
       </w:pPr>
     </w:p>
     <w:p>
-      <w:pPr>
-        <w:rPr>
-          <w:bCs/>
-          <w:sz w:val="22"/>
-          <w:szCs w:val="22"/>
-        </w:rPr>
-      </w:pPr>
-      <w:r>
-        <w:rPr>
-          <w:bCs/>
-          <w:sz w:val="22"/>
-          <w:szCs w:val="22"/>
-        </w:rPr>
-        <w:fldChar w:fldCharType="begin"/>
-      </w:r>
-      <w:r>
-        <w:rPr>
-          <w:bCs/>
-          <w:sz w:val="22"/>
-          <w:szCs w:val="22"/>
-        </w:rPr>
-        <w:instrText xml:space="preserve"> MERGEFIELD  review  \* MERGEFORMAT </w:instrText>
-      </w:r>
-      <w:r>
-        <w:rPr>
-          <w:bCs/>
-          <w:sz w:val="22"/>
-          <w:szCs w:val="22"/>
-        </w:rPr>
-        <w:fldChar w:fldCharType="separate"/>
-      </w:r>
-      <w:r>
-        <w:rPr>
-          <w:bCs/>
-          <w:noProof/>
-          <w:sz w:val="22"/>
-          <w:szCs w:val="22"/>
-        </w:rPr>
-        <w:t>«review»</w:t>
-      </w:r>
-      <w:r>
-        <w:rPr>
-          <w:bCs/>
-          <w:sz w:val="22"/>
-          <w:szCs w:val="22"/>
-        </w:rPr>
-        <w:fldChar w:fldCharType="end"/>
-      </w:r>
-    </w:p>
-    <w:p>
-      <w:pPr>
-        <w:rPr>
-          <w:b/>
-          <w:bCs/>
-          <w:sz w:val="22"/>
-          <w:szCs w:val="22"/>
-        </w:rPr>
-      </w:pPr>
-    </w:p>
-    <w:p>
       <w:r>
         <w:t xml:space="preserve">Bamberg, </w:t>
       </w:r>
-      <w:r>
-        <w:fldChar w:fldCharType="begin"/>
-      </w:r>
-      <w:r>
-        <w:instrText xml:space="preserve"> MERGEFIELD  Date  \* MERGEFORMAT </w:instrText>
-      </w:r>
-      <w:r>
-        <w:fldChar w:fldCharType="separate"/>
-      </w:r>
-      <w:r>
-        <w:t>«Date»</w:t>
-      </w:r>
-      <w:r>
-        <w:fldChar w:fldCharType="end"/>
-      </w:r>
+      <w:fldSimple w:instr=" MERGEFIELD  Date  \* MERGEFORMAT ">
+        <w:r>
+          <w:t>«Date»</w:t>
+        </w:r>
+      </w:fldSimple>
       <w:r>
         <w:tab/>
       </w:r>
@@ -627,7 +516,7 @@
 </file>
 
 <file path=word/endnotes.xml><?xml version="1.0" encoding="utf-8"?>
-<w:endnotes xmlns:wpc="http://schemas.microsoft.com/office/word/2010/wordprocessingCanvas" xmlns:cx="http://schemas.microsoft.com/office/drawing/2014/chartex" xmlns:cx1="http://schemas.microsoft.com/office/drawing/2015/9/8/chartex" xmlns:cx2="http://schemas.microsoft.com/office/drawing/2015/10/21/chartex" xmlns:cx3="http://schemas.microsoft.com/office/drawing/2016/5/9/chartex" xmlns:cx4="http://schemas.microsoft.com/office/drawing/2016/5/10/chartex" xmlns:cx5="http://schemas.microsoft.com/office/drawing/2016/5/11/chartex" xmlns:cx6="http://schemas.microsoft.com/office/drawing/2016/5/12/chartex" xmlns:cx7="http://schemas.microsoft.com/office/drawing/2016/5/13/chartex" xmlns:cx8="http://schemas.microsoft.com/office/drawing/2016/5/14/chartex" xmlns:mc="http://schemas.openxmlformats.org/markup-compatibility/2006" xmlns:aink="http://schemas.microsoft.com/office/drawing/2016/ink" xmlns:am3d="http://schemas.microsoft.com/office/drawing/2017/model3d" xmlns:o="urn:schemas-microsoft-com:office:office" xmlns:oel="http://schemas.microsoft.com/office/2019/extlst" xmlns:r="http://schemas.openxmlformats.org/officeDocument/2006/relationships" xmlns:m="http://schemas.openxmlformats.org/officeDocument/2006/math" xmlns:v="urn:schemas-microsoft-com:vml" xmlns:wp14="http://schemas.microsoft.com/office/word/2010/wordprocessingDrawing" xmlns:wp="http://schemas.openxmlformats.org/drawingml/2006/wordprocessingDrawing" xmlns:w10="urn:schemas-microsoft-com:office:word" xmlns:w="http://schemas.openxmlformats.org/wordprocessingml/2006/main" xmlns:w14="http://schemas.microsoft.com/office/word/2010/wordml" xmlns:w15="http://schemas.microsoft.com/office/word/2012/wordml" xmlns:w16cex="http://schemas.microsoft.com/office/word/2018/wordml/cex" xmlns:w16cid="http://schemas.microsoft.com/office/word/2016/wordml/cid" xmlns:w16="http://schemas.microsoft.com/office/word/2018/wordml" xmlns:w16sdtdh="http://schemas.microsoft.com/office/word/2020/wordml/sdtdatahash" xmlns:w16se="http://schemas.microsoft.com/office/word/2015/wordml/symex" xmlns:wpg="http://schemas.microsoft.com/office/word/2010/wordprocessingGroup" xmlns:wpi="http://schemas.microsoft.com/office/word/2010/wordprocessingInk" xmlns:wne="http://schemas.microsoft.com/office/word/2006/wordml" xmlns:wps="http://schemas.microsoft.com/office/word/2010/wordprocessingShape" mc:Ignorable="w14 w15 w16se w16cid w16 w16cex w16sdtdh wp14">
+<w:endnotes xmlns:wpc="http://schemas.microsoft.com/office/word/2010/wordprocessingCanvas" xmlns:cx="http://schemas.microsoft.com/office/drawing/2014/chartex" xmlns:cx1="http://schemas.microsoft.com/office/drawing/2015/9/8/chartex" xmlns:cx2="http://schemas.microsoft.com/office/drawing/2015/10/21/chartex" xmlns:cx3="http://schemas.microsoft.com/office/drawing/2016/5/9/chartex" xmlns:cx4="http://schemas.microsoft.com/office/drawing/2016/5/10/chartex" xmlns:cx5="http://schemas.microsoft.com/office/drawing/2016/5/11/chartex" xmlns:cx6="http://schemas.microsoft.com/office/drawing/2016/5/12/chartex" xmlns:cx7="http://schemas.microsoft.com/office/drawing/2016/5/13/chartex" xmlns:cx8="http://schemas.microsoft.com/office/drawing/2016/5/14/chartex" xmlns:mc="http://schemas.openxmlformats.org/markup-compatibility/2006" xmlns:aink="http://schemas.microsoft.com/office/drawing/2016/ink" xmlns:am3d="http://schemas.microsoft.com/office/drawing/2017/model3d" xmlns:o="urn:schemas-microsoft-com:office:office" xmlns:oel="http://schemas.microsoft.com/office/2019/extlst" xmlns:r="http://schemas.openxmlformats.org/officeDocument/2006/relationships" xmlns:m="http://schemas.openxmlformats.org/officeDocument/2006/math" xmlns:v="urn:schemas-microsoft-com:vml" xmlns:wp14="http://schemas.microsoft.com/office/word/2010/wordprocessingDrawing" xmlns:wp="http://schemas.openxmlformats.org/drawingml/2006/wordprocessingDrawing" xmlns:w10="urn:schemas-microsoft-com:office:word" xmlns:w="http://schemas.openxmlformats.org/wordprocessingml/2006/main" xmlns:w14="http://schemas.microsoft.com/office/word/2010/wordml" xmlns:w15="http://schemas.microsoft.com/office/word/2012/wordml" xmlns:w16cex="http://schemas.microsoft.com/office/word/2018/wordml/cex" xmlns:w16cid="http://schemas.microsoft.com/office/word/2016/wordml/cid" xmlns:w16="http://schemas.microsoft.com/office/word/2018/wordml" xmlns:w16du="http://schemas.microsoft.com/office/word/2023/wordml/word16du" xmlns:w16sdtdh="http://schemas.microsoft.com/office/word/2020/wordml/sdtdatahash" xmlns:w16sdtfl="http://schemas.microsoft.com/office/word/2024/wordml/sdtformatlock" xmlns:w16se="http://schemas.microsoft.com/office/word/2015/wordml/symex" xmlns:wpg="http://schemas.microsoft.com/office/word/2010/wordprocessingGroup" xmlns:wpi="http://schemas.microsoft.com/office/word/2010/wordprocessingInk" xmlns:wne="http://schemas.microsoft.com/office/word/2006/wordml" xmlns:wps="http://schemas.microsoft.com/office/word/2010/wordprocessingShape" mc:Ignorable="w14 w15 w16se w16cid w16 w16cex w16sdtdh w16sdtfl w16du wp14">
   <w:endnote w:type="separator" w:id="-1">
     <w:p>
       <w:pPr>
@@ -652,7 +541,7 @@
 </file>
 
 <file path=word/footnotes.xml><?xml version="1.0" encoding="utf-8"?>
-<w:footnotes xmlns:wpc="http://schemas.microsoft.com/office/word/2010/wordprocessingCanvas" xmlns:cx="http://schemas.microsoft.com/office/drawing/2014/chartex" xmlns:cx1="http://schemas.microsoft.com/office/drawing/2015/9/8/chartex" xmlns:cx2="http://schemas.microsoft.com/office/drawing/2015/10/21/chartex" xmlns:cx3="http://schemas.microsoft.com/office/drawing/2016/5/9/chartex" xmlns:cx4="http://schemas.microsoft.com/office/drawing/2016/5/10/chartex" xmlns:cx5="http://schemas.microsoft.com/office/drawing/2016/5/11/chartex" xmlns:cx6="http://schemas.microsoft.com/office/drawing/2016/5/12/chartex" xmlns:cx7="http://schemas.microsoft.com/office/drawing/2016/5/13/chartex" xmlns:cx8="http://schemas.microsoft.com/office/drawing/2016/5/14/chartex" xmlns:mc="http://schemas.openxmlformats.org/markup-compatibility/2006" xmlns:aink="http://schemas.microsoft.com/office/drawing/2016/ink" xmlns:am3d="http://schemas.microsoft.com/office/drawing/2017/model3d" xmlns:o="urn:schemas-microsoft-com:office:office" xmlns:oel="http://schemas.microsoft.com/office/2019/extlst" xmlns:r="http://schemas.openxmlformats.org/officeDocument/2006/relationships" xmlns:m="http://schemas.openxmlformats.org/officeDocument/2006/math" xmlns:v="urn:schemas-microsoft-com:vml" xmlns:wp14="http://schemas.microsoft.com/office/word/2010/wordprocessingDrawing" xmlns:wp="http://schemas.openxmlformats.org/drawingml/2006/wordprocessingDrawing" xmlns:w10="urn:schemas-microsoft-com:office:word" xmlns:w="http://schemas.openxmlformats.org/wordprocessingml/2006/main" xmlns:w14="http://schemas.microsoft.com/office/word/2010/wordml" xmlns:w15="http://schemas.microsoft.com/office/word/2012/wordml" xmlns:w16cex="http://schemas.microsoft.com/office/word/2018/wordml/cex" xmlns:w16cid="http://schemas.microsoft.com/office/word/2016/wordml/cid" xmlns:w16="http://schemas.microsoft.com/office/word/2018/wordml" xmlns:w16sdtdh="http://schemas.microsoft.com/office/word/2020/wordml/sdtdatahash" xmlns:w16se="http://schemas.microsoft.com/office/word/2015/wordml/symex" xmlns:wpg="http://schemas.microsoft.com/office/word/2010/wordprocessingGroup" xmlns:wpi="http://schemas.microsoft.com/office/word/2010/wordprocessingInk" xmlns:wne="http://schemas.microsoft.com/office/word/2006/wordml" xmlns:wps="http://schemas.microsoft.com/office/word/2010/wordprocessingShape" mc:Ignorable="w14 w15 w16se w16cid w16 w16cex w16sdtdh wp14">
+<w:footnotes xmlns:wpc="http://schemas.microsoft.com/office/word/2010/wordprocessingCanvas" xmlns:cx="http://schemas.microsoft.com/office/drawing/2014/chartex" xmlns:cx1="http://schemas.microsoft.com/office/drawing/2015/9/8/chartex" xmlns:cx2="http://schemas.microsoft.com/office/drawing/2015/10/21/chartex" xmlns:cx3="http://schemas.microsoft.com/office/drawing/2016/5/9/chartex" xmlns:cx4="http://schemas.microsoft.com/office/drawing/2016/5/10/chartex" xmlns:cx5="http://schemas.microsoft.com/office/drawing/2016/5/11/chartex" xmlns:cx6="http://schemas.microsoft.com/office/drawing/2016/5/12/chartex" xmlns:cx7="http://schemas.microsoft.com/office/drawing/2016/5/13/chartex" xmlns:cx8="http://schemas.microsoft.com/office/drawing/2016/5/14/chartex" xmlns:mc="http://schemas.openxmlformats.org/markup-compatibility/2006" xmlns:aink="http://schemas.microsoft.com/office/drawing/2016/ink" xmlns:am3d="http://schemas.microsoft.com/office/drawing/2017/model3d" xmlns:o="urn:schemas-microsoft-com:office:office" xmlns:oel="http://schemas.microsoft.com/office/2019/extlst" xmlns:r="http://schemas.openxmlformats.org/officeDocument/2006/relationships" xmlns:m="http://schemas.openxmlformats.org/officeDocument/2006/math" xmlns:v="urn:schemas-microsoft-com:vml" xmlns:wp14="http://schemas.microsoft.com/office/word/2010/wordprocessingDrawing" xmlns:wp="http://schemas.openxmlformats.org/drawingml/2006/wordprocessingDrawing" xmlns:w10="urn:schemas-microsoft-com:office:word" xmlns:w="http://schemas.openxmlformats.org/wordprocessingml/2006/main" xmlns:w14="http://schemas.microsoft.com/office/word/2010/wordml" xmlns:w15="http://schemas.microsoft.com/office/word/2012/wordml" xmlns:w16cex="http://schemas.microsoft.com/office/word/2018/wordml/cex" xmlns:w16cid="http://schemas.microsoft.com/office/word/2016/wordml/cid" xmlns:w16="http://schemas.microsoft.com/office/word/2018/wordml" xmlns:w16du="http://schemas.microsoft.com/office/word/2023/wordml/word16du" xmlns:w16sdtdh="http://schemas.microsoft.com/office/word/2020/wordml/sdtdatahash" xmlns:w16sdtfl="http://schemas.microsoft.com/office/word/2024/wordml/sdtformatlock" xmlns:w16se="http://schemas.microsoft.com/office/word/2015/wordml/symex" xmlns:wpg="http://schemas.microsoft.com/office/word/2010/wordprocessingGroup" xmlns:wpi="http://schemas.microsoft.com/office/word/2010/wordprocessingInk" xmlns:wne="http://schemas.microsoft.com/office/word/2006/wordml" xmlns:wps="http://schemas.microsoft.com/office/word/2010/wordprocessingShape" mc:Ignorable="w14 w15 w16se w16cid w16 w16cex w16sdtdh w16sdtfl w16du wp14">
   <w:footnote w:type="separator" w:id="-1">
     <w:p>
       <w:pPr>
@@ -677,7 +566,7 @@
 </file>
 
 <file path=word/header1.xml><?xml version="1.0" encoding="utf-8"?>
-<w:hdr xmlns:wpc="http://schemas.microsoft.com/office/word/2010/wordprocessingCanvas" xmlns:cx="http://schemas.microsoft.com/office/drawing/2014/chartex" xmlns:cx1="http://schemas.microsoft.com/office/drawing/2015/9/8/chartex" xmlns:cx2="http://schemas.microsoft.com/office/drawing/2015/10/21/chartex" xmlns:cx3="http://schemas.microsoft.com/office/drawing/2016/5/9/chartex" xmlns:cx4="http://schemas.microsoft.com/office/drawing/2016/5/10/chartex" xmlns:cx5="http://schemas.microsoft.com/office/drawing/2016/5/11/chartex" xmlns:cx6="http://schemas.microsoft.com/office/drawing/2016/5/12/chartex" xmlns:cx7="http://schemas.microsoft.com/office/drawing/2016/5/13/chartex" xmlns:cx8="http://schemas.microsoft.com/office/drawing/2016/5/14/chartex" xmlns:mc="http://schemas.openxmlformats.org/markup-compatibility/2006" xmlns:aink="http://schemas.microsoft.com/office/drawing/2016/ink" xmlns:am3d="http://schemas.microsoft.com/office/drawing/2017/model3d" xmlns:o="urn:schemas-microsoft-com:office:office" xmlns:oel="http://schemas.microsoft.com/office/2019/extlst" xmlns:r="http://schemas.openxmlformats.org/officeDocument/2006/relationships" xmlns:m="http://schemas.openxmlformats.org/officeDocument/2006/math" xmlns:v="urn:schemas-microsoft-com:vml" xmlns:wp14="http://schemas.microsoft.com/office/word/2010/wordprocessingDrawing" xmlns:wp="http://schemas.openxmlformats.org/drawingml/2006/wordprocessingDrawing" xmlns:w10="urn:schemas-microsoft-com:office:word" xmlns:w="http://schemas.openxmlformats.org/wordprocessingml/2006/main" xmlns:w14="http://schemas.microsoft.com/office/word/2010/wordml" xmlns:w15="http://schemas.microsoft.com/office/word/2012/wordml" xmlns:w16cex="http://schemas.microsoft.com/office/word/2018/wordml/cex" xmlns:w16cid="http://schemas.microsoft.com/office/word/2016/wordml/cid" xmlns:w16="http://schemas.microsoft.com/office/word/2018/wordml" xmlns:w16sdtdh="http://schemas.microsoft.com/office/word/2020/wordml/sdtdatahash" xmlns:w16se="http://schemas.microsoft.com/office/word/2015/wordml/symex" xmlns:wpg="http://schemas.microsoft.com/office/word/2010/wordprocessingGroup" xmlns:wpi="http://schemas.microsoft.com/office/word/2010/wordprocessingInk" xmlns:wne="http://schemas.microsoft.com/office/word/2006/wordml" xmlns:wps="http://schemas.microsoft.com/office/word/2010/wordprocessingShape" mc:Ignorable="w14 w15 w16se w16cid w16 w16cex w16sdtdh wp14">
+<w:hdr xmlns:wpc="http://schemas.microsoft.com/office/word/2010/wordprocessingCanvas" xmlns:cx="http://schemas.microsoft.com/office/drawing/2014/chartex" xmlns:cx1="http://schemas.microsoft.com/office/drawing/2015/9/8/chartex" xmlns:cx2="http://schemas.microsoft.com/office/drawing/2015/10/21/chartex" xmlns:cx3="http://schemas.microsoft.com/office/drawing/2016/5/9/chartex" xmlns:cx4="http://schemas.microsoft.com/office/drawing/2016/5/10/chartex" xmlns:cx5="http://schemas.microsoft.com/office/drawing/2016/5/11/chartex" xmlns:cx6="http://schemas.microsoft.com/office/drawing/2016/5/12/chartex" xmlns:cx7="http://schemas.microsoft.com/office/drawing/2016/5/13/chartex" xmlns:cx8="http://schemas.microsoft.com/office/drawing/2016/5/14/chartex" xmlns:mc="http://schemas.openxmlformats.org/markup-compatibility/2006" xmlns:aink="http://schemas.microsoft.com/office/drawing/2016/ink" xmlns:am3d="http://schemas.microsoft.com/office/drawing/2017/model3d" xmlns:o="urn:schemas-microsoft-com:office:office" xmlns:oel="http://schemas.microsoft.com/office/2019/extlst" xmlns:r="http://schemas.openxmlformats.org/officeDocument/2006/relationships" xmlns:m="http://schemas.openxmlformats.org/officeDocument/2006/math" xmlns:v="urn:schemas-microsoft-com:vml" xmlns:wp14="http://schemas.microsoft.com/office/word/2010/wordprocessingDrawing" xmlns:wp="http://schemas.openxmlformats.org/drawingml/2006/wordprocessingDrawing" xmlns:w10="urn:schemas-microsoft-com:office:word" xmlns:w="http://schemas.openxmlformats.org/wordprocessingml/2006/main" xmlns:w14="http://schemas.microsoft.com/office/word/2010/wordml" xmlns:w15="http://schemas.microsoft.com/office/word/2012/wordml" xmlns:w16cex="http://schemas.microsoft.com/office/word/2018/wordml/cex" xmlns:w16cid="http://schemas.microsoft.com/office/word/2016/wordml/cid" xmlns:w16="http://schemas.microsoft.com/office/word/2018/wordml" xmlns:w16du="http://schemas.microsoft.com/office/word/2023/wordml/word16du" xmlns:w16sdtdh="http://schemas.microsoft.com/office/word/2020/wordml/sdtdatahash" xmlns:w16sdtfl="http://schemas.microsoft.com/office/word/2024/wordml/sdtformatlock" xmlns:w16se="http://schemas.microsoft.com/office/word/2015/wordml/symex" xmlns:wpg="http://schemas.microsoft.com/office/word/2010/wordprocessingGroup" xmlns:wpi="http://schemas.microsoft.com/office/word/2010/wordprocessingInk" xmlns:wne="http://schemas.microsoft.com/office/word/2006/wordml" xmlns:wps="http://schemas.microsoft.com/office/word/2010/wordprocessingShape" mc:Ignorable="w14 w15 w16se w16cid w16 w16cex w16sdtdh w16sdtfl w16du wp14">
   <w:p>
     <w:pPr>
       <w:pStyle w:val="Kopfzeile"/>
@@ -757,7 +646,7 @@
 </file>
 
 <file path=word/styles.xml><?xml version="1.0" encoding="utf-8"?>
-<w:styles xmlns:mc="http://schemas.openxmlformats.org/markup-compatibility/2006" xmlns:r="http://schemas.openxmlformats.org/officeDocument/2006/relationships" xmlns:w="http://schemas.openxmlformats.org/wordprocessingml/2006/main" xmlns:w14="http://schemas.microsoft.com/office/word/2010/wordml" xmlns:w15="http://schemas.microsoft.com/office/word/2012/wordml" xmlns:w16cex="http://schemas.microsoft.com/office/word/2018/wordml/cex" xmlns:w16cid="http://schemas.microsoft.com/office/word/2016/wordml/cid" xmlns:w16="http://schemas.microsoft.com/office/word/2018/wordml" xmlns:w16sdtdh="http://schemas.microsoft.com/office/word/2020/wordml/sdtdatahash" xmlns:w16se="http://schemas.microsoft.com/office/word/2015/wordml/symex" mc:Ignorable="w14 w15 w16se w16cid w16 w16cex w16sdtdh">
+<w:styles xmlns:mc="http://schemas.openxmlformats.org/markup-compatibility/2006" xmlns:r="http://schemas.openxmlformats.org/officeDocument/2006/relationships" xmlns:w="http://schemas.openxmlformats.org/wordprocessingml/2006/main" xmlns:w14="http://schemas.microsoft.com/office/word/2010/wordml" xmlns:w15="http://schemas.microsoft.com/office/word/2012/wordml" xmlns:w16cex="http://schemas.microsoft.com/office/word/2018/wordml/cex" xmlns:w16cid="http://schemas.microsoft.com/office/word/2016/wordml/cid" xmlns:w16="http://schemas.microsoft.com/office/word/2018/wordml" xmlns:w16du="http://schemas.microsoft.com/office/word/2023/wordml/word16du" xmlns:w16sdtdh="http://schemas.microsoft.com/office/word/2020/wordml/sdtdatahash" xmlns:w16sdtfl="http://schemas.microsoft.com/office/word/2024/wordml/sdtformatlock" xmlns:w16se="http://schemas.microsoft.com/office/word/2015/wordml/symex" mc:Ignorable="w14 w15 w16se w16cid w16 w16cex w16sdtdh w16sdtfl w16du">
   <w:docDefaults>
     <w:rPrDefault>
       <w:rPr>

</xml_diff>